<commit_message>
update template surat pernyataan PKL
</commit_message>
<xml_diff>
--- a/public/template/surat_pernyataan.docx
+++ b/public/template/surat_pernyataan.docx
@@ -1,6 +1,6 @@
 
 <file path=word/document.xml><?xml version="1.0" encoding="utf-8"?>
-<w:document xmlns:wpc="http://schemas.microsoft.com/office/word/2010/wordprocessingCanvas" xmlns:cx="http://schemas.microsoft.com/office/drawing/2014/chartex" xmlns:cx1="http://schemas.microsoft.com/office/drawing/2015/9/8/chartex" xmlns:cx2="http://schemas.microsoft.com/office/drawing/2015/10/21/chartex" xmlns:cx3="http://schemas.microsoft.com/office/drawing/2016/5/9/chartex" xmlns:cx4="http://schemas.microsoft.com/office/drawing/2016/5/10/chartex" xmlns:cx5="http://schemas.microsoft.com/office/drawing/2016/5/11/chartex" xmlns:cx6="http://schemas.microsoft.com/office/drawing/2016/5/12/chartex" xmlns:cx7="http://schemas.microsoft.com/office/drawing/2016/5/13/chartex" xmlns:cx8="http://schemas.microsoft.com/office/drawing/2016/5/14/chartex" xmlns:mc="http://schemas.openxmlformats.org/markup-compatibility/2006" xmlns:aink="http://schemas.microsoft.com/office/drawing/2016/ink" xmlns:am3d="http://schemas.microsoft.com/office/drawing/2017/model3d" xmlns:o="urn:schemas-microsoft-com:office:office" xmlns:r="http://schemas.openxmlformats.org/officeDocument/2006/relationships" xmlns:m="http://schemas.openxmlformats.org/officeDocument/2006/math" xmlns:v="urn:schemas-microsoft-com:vml" xmlns:wp14="http://schemas.microsoft.com/office/word/2010/wordprocessingDrawing" xmlns:wp="http://schemas.openxmlformats.org/drawingml/2006/wordprocessingDrawing" xmlns:w10="urn:schemas-microsoft-com:office:word" xmlns:w="http://schemas.openxmlformats.org/wordprocessingml/2006/main" xmlns:w14="http://schemas.microsoft.com/office/word/2010/wordml" xmlns:w15="http://schemas.microsoft.com/office/word/2012/wordml" xmlns:w16cex="http://schemas.microsoft.com/office/word/2018/wordml/cex" xmlns:w16cid="http://schemas.microsoft.com/office/word/2016/wordml/cid" xmlns:w16="http://schemas.microsoft.com/office/word/2018/wordml" xmlns:w16sdtdh="http://schemas.microsoft.com/office/word/2020/wordml/sdtdatahash" xmlns:w16se="http://schemas.microsoft.com/office/word/2015/wordml/symex" xmlns:wpg="http://schemas.microsoft.com/office/word/2010/wordprocessingGroup" xmlns:wpi="http://schemas.microsoft.com/office/word/2010/wordprocessingInk" xmlns:wne="http://schemas.microsoft.com/office/word/2006/wordml" xmlns:wps="http://schemas.microsoft.com/office/word/2010/wordprocessingShape" mc:Ignorable="w14 w15 w16se w16cid w16 w16cex w16sdtdh wp14">
+<w:document xmlns:wpc="http://schemas.microsoft.com/office/word/2010/wordprocessingCanvas" xmlns:cx="http://schemas.microsoft.com/office/drawing/2014/chartex" xmlns:cx1="http://schemas.microsoft.com/office/drawing/2015/9/8/chartex" xmlns:cx2="http://schemas.microsoft.com/office/drawing/2015/10/21/chartex" xmlns:cx3="http://schemas.microsoft.com/office/drawing/2016/5/9/chartex" xmlns:cx4="http://schemas.microsoft.com/office/drawing/2016/5/10/chartex" xmlns:cx5="http://schemas.microsoft.com/office/drawing/2016/5/11/chartex" xmlns:cx6="http://schemas.microsoft.com/office/drawing/2016/5/12/chartex" xmlns:cx7="http://schemas.microsoft.com/office/drawing/2016/5/13/chartex" xmlns:cx8="http://schemas.microsoft.com/office/drawing/2016/5/14/chartex" xmlns:mc="http://schemas.openxmlformats.org/markup-compatibility/2006" xmlns:aink="http://schemas.microsoft.com/office/drawing/2016/ink" xmlns:am3d="http://schemas.microsoft.com/office/drawing/2017/model3d" xmlns:o="urn:schemas-microsoft-com:office:office" xmlns:oel="http://schemas.microsoft.com/office/2019/extlst" xmlns:r="http://schemas.openxmlformats.org/officeDocument/2006/relationships" xmlns:m="http://schemas.openxmlformats.org/officeDocument/2006/math" xmlns:v="urn:schemas-microsoft-com:vml" xmlns:wp14="http://schemas.microsoft.com/office/word/2010/wordprocessingDrawing" xmlns:wp="http://schemas.openxmlformats.org/drawingml/2006/wordprocessingDrawing" xmlns:w10="urn:schemas-microsoft-com:office:word" xmlns:w="http://schemas.openxmlformats.org/wordprocessingml/2006/main" xmlns:w14="http://schemas.microsoft.com/office/word/2010/wordml" xmlns:w15="http://schemas.microsoft.com/office/word/2012/wordml" xmlns:w16cex="http://schemas.microsoft.com/office/word/2018/wordml/cex" xmlns:w16cid="http://schemas.microsoft.com/office/word/2016/wordml/cid" xmlns:w16="http://schemas.microsoft.com/office/word/2018/wordml" xmlns:w16du="http://schemas.microsoft.com/office/word/2023/wordml/word16du" xmlns:w16sdtdh="http://schemas.microsoft.com/office/word/2020/wordml/sdtdatahash" xmlns:w16sdtfl="http://schemas.microsoft.com/office/word/2024/wordml/sdtformatlock" xmlns:w16se="http://schemas.microsoft.com/office/word/2015/wordml/symex" xmlns:wpg="http://schemas.microsoft.com/office/word/2010/wordprocessingGroup" xmlns:wpi="http://schemas.microsoft.com/office/word/2010/wordprocessingInk" xmlns:wne="http://schemas.microsoft.com/office/word/2006/wordml" xmlns:wps="http://schemas.microsoft.com/office/word/2010/wordprocessingShape" mc:Ignorable="w14 w15 w16se w16cid w16 w16cex w16sdtdh w16sdtfl w16du wp14">
   <w:body>
     <w:p>
       <w:pPr>
@@ -985,106 +985,95 @@
           <w:bdr w:val="none" w:sz="0" w:space="0" w:color="auto" w:frame="1"/>
           <w:lang w:val="en-ID" w:eastAsia="en-ID"/>
         </w:rPr>
+        <w:t>5</w:t>
+      </w:r>
+      <w:r>
+        <w:rPr>
+          <w:rFonts w:ascii="Times New Roman" w:eastAsia="Times New Roman" w:hAnsi="Times New Roman" w:cs="Times New Roman"/>
+          <w:color w:val="1F1F1F"/>
+          <w:sz w:val="24"/>
+          <w:szCs w:val="24"/>
+          <w:bdr w:val="none" w:sz="0" w:space="0" w:color="auto" w:frame="1"/>
+          <w:lang w:val="en-ID" w:eastAsia="en-ID"/>
+        </w:rPr>
+        <w:t xml:space="preserve"> (</w:t>
+      </w:r>
+      <w:r>
+        <w:rPr>
+          <w:rFonts w:ascii="Times New Roman" w:eastAsia="Times New Roman" w:hAnsi="Times New Roman" w:cs="Times New Roman"/>
+          <w:color w:val="1F1F1F"/>
+          <w:sz w:val="24"/>
+          <w:szCs w:val="24"/>
+          <w:bdr w:val="none" w:sz="0" w:space="0" w:color="auto" w:frame="1"/>
+          <w:lang w:val="en-ID" w:eastAsia="en-ID"/>
+        </w:rPr>
+        <w:t>bulan</w:t>
+      </w:r>
+      <w:r>
+        <w:rPr>
+          <w:rFonts w:ascii="Times New Roman" w:eastAsia="Times New Roman" w:hAnsi="Times New Roman" w:cs="Times New Roman"/>
+          <w:color w:val="1F1F1F"/>
+          <w:sz w:val="24"/>
+          <w:szCs w:val="24"/>
+          <w:bdr w:val="none" w:sz="0" w:space="0" w:color="auto" w:frame="1"/>
+          <w:lang w:val="en-ID" w:eastAsia="en-ID"/>
+        </w:rPr>
+        <w:t xml:space="preserve">) bulan dimulai dari </w:t>
+      </w:r>
+      <w:r>
+        <w:rPr>
+          <w:rFonts w:ascii="Times New Roman" w:eastAsia="Times New Roman" w:hAnsi="Times New Roman" w:cs="Times New Roman"/>
+          <w:color w:val="1F1F1F"/>
+          <w:sz w:val="24"/>
+          <w:szCs w:val="24"/>
+          <w:bdr w:val="none" w:sz="0" w:space="0" w:color="auto" w:frame="1"/>
+          <w:lang w:val="en-ID" w:eastAsia="en-ID"/>
+        </w:rPr>
+        <w:t xml:space="preserve">Juni </w:t>
+      </w:r>
+      <w:r>
+        <w:rPr>
+          <w:rFonts w:ascii="Times New Roman" w:eastAsia="Times New Roman" w:hAnsi="Times New Roman" w:cs="Times New Roman"/>
+          <w:color w:val="1F1F1F"/>
+          <w:sz w:val="24"/>
+          <w:szCs w:val="24"/>
+          <w:bdr w:val="none" w:sz="0" w:space="0" w:color="auto" w:frame="1"/>
+          <w:lang w:val="en-ID" w:eastAsia="en-ID"/>
+        </w:rPr>
+        <w:t xml:space="preserve">s.d </w:t>
+      </w:r>
+      <w:r>
+        <w:rPr>
+          <w:rFonts w:ascii="Times New Roman" w:eastAsia="Times New Roman" w:hAnsi="Times New Roman" w:cs="Times New Roman"/>
+          <w:color w:val="1F1F1F"/>
+          <w:sz w:val="24"/>
+          <w:szCs w:val="24"/>
+          <w:bdr w:val="none" w:sz="0" w:space="0" w:color="auto" w:frame="1"/>
+          <w:lang w:val="en-ID" w:eastAsia="en-ID"/>
+        </w:rPr>
+        <w:t>Oktober</w:t>
+      </w:r>
+      <w:r>
+        <w:rPr>
+          <w:rFonts w:ascii="Times New Roman" w:eastAsia="Times New Roman" w:hAnsi="Times New Roman" w:cs="Times New Roman"/>
+          <w:color w:val="1F1F1F"/>
+          <w:sz w:val="24"/>
+          <w:szCs w:val="24"/>
+          <w:bdr w:val="none" w:sz="0" w:space="0" w:color="auto" w:frame="1"/>
+          <w:lang w:val="en-ID" w:eastAsia="en-ID"/>
+        </w:rPr>
+        <w:t xml:space="preserve"> 202</w:t>
+      </w:r>
+      <w:r>
+        <w:rPr>
+          <w:rFonts w:ascii="Times New Roman" w:eastAsia="Times New Roman" w:hAnsi="Times New Roman" w:cs="Times New Roman"/>
+          <w:color w:val="1F1F1F"/>
+          <w:sz w:val="24"/>
+          <w:szCs w:val="24"/>
+          <w:bdr w:val="none" w:sz="0" w:space="0" w:color="auto" w:frame="1"/>
+          <w:lang w:val="en-ID" w:eastAsia="en-ID"/>
+        </w:rPr>
         <w:t>6</w:t>
-      </w:r>
-      <w:r>
-        <w:rPr>
-          <w:rFonts w:ascii="Times New Roman" w:eastAsia="Times New Roman" w:hAnsi="Times New Roman" w:cs="Times New Roman"/>
-          <w:color w:val="1F1F1F"/>
-          <w:sz w:val="24"/>
-          <w:szCs w:val="24"/>
-          <w:bdr w:val="none" w:sz="0" w:space="0" w:color="auto" w:frame="1"/>
-          <w:lang w:val="en-ID" w:eastAsia="en-ID"/>
-        </w:rPr>
-        <w:t xml:space="preserve"> (</w:t>
-      </w:r>
-      <w:r>
-        <w:rPr>
-          <w:rFonts w:ascii="Times New Roman" w:eastAsia="Times New Roman" w:hAnsi="Times New Roman" w:cs="Times New Roman"/>
-          <w:color w:val="1F1F1F"/>
-          <w:sz w:val="24"/>
-          <w:szCs w:val="24"/>
-          <w:bdr w:val="none" w:sz="0" w:space="0" w:color="auto" w:frame="1"/>
-          <w:lang w:val="en-ID" w:eastAsia="en-ID"/>
-        </w:rPr>
-        <w:t>bulan</w:t>
-      </w:r>
-      <w:r>
-        <w:rPr>
-          <w:rFonts w:ascii="Times New Roman" w:eastAsia="Times New Roman" w:hAnsi="Times New Roman" w:cs="Times New Roman"/>
-          <w:color w:val="1F1F1F"/>
-          <w:sz w:val="24"/>
-          <w:szCs w:val="24"/>
-          <w:bdr w:val="none" w:sz="0" w:space="0" w:color="auto" w:frame="1"/>
-          <w:lang w:val="en-ID" w:eastAsia="en-ID"/>
-        </w:rPr>
-        <w:t xml:space="preserve">) bulan dimulai dari tanggal </w:t>
-      </w:r>
-      <w:r>
-        <w:rPr>
-          <w:rFonts w:ascii="Times New Roman" w:eastAsia="Times New Roman" w:hAnsi="Times New Roman" w:cs="Times New Roman"/>
-          <w:color w:val="1F1F1F"/>
-          <w:sz w:val="24"/>
-          <w:szCs w:val="24"/>
-          <w:bdr w:val="none" w:sz="0" w:space="0" w:color="auto" w:frame="1"/>
-          <w:lang w:val="en-ID" w:eastAsia="en-ID"/>
-        </w:rPr>
-        <w:t>1 Juli s.d 3</w:t>
-      </w:r>
-      <w:r>
-        <w:rPr>
-          <w:rFonts w:ascii="Times New Roman" w:eastAsia="Times New Roman" w:hAnsi="Times New Roman" w:cs="Times New Roman"/>
-          <w:color w:val="1F1F1F"/>
-          <w:sz w:val="24"/>
-          <w:szCs w:val="24"/>
-          <w:bdr w:val="none" w:sz="0" w:space="0" w:color="auto" w:frame="1"/>
-          <w:lang w:val="en-ID" w:eastAsia="en-ID"/>
-        </w:rPr>
-        <w:t>1</w:t>
-      </w:r>
-      <w:r>
-        <w:rPr>
-          <w:rFonts w:ascii="Times New Roman" w:eastAsia="Times New Roman" w:hAnsi="Times New Roman" w:cs="Times New Roman"/>
-          <w:color w:val="1F1F1F"/>
-          <w:sz w:val="24"/>
-          <w:szCs w:val="24"/>
-          <w:bdr w:val="none" w:sz="0" w:space="0" w:color="auto" w:frame="1"/>
-          <w:lang w:val="en-ID" w:eastAsia="en-ID"/>
-        </w:rPr>
-        <w:t xml:space="preserve"> </w:t>
-      </w:r>
-      <w:r>
-        <w:rPr>
-          <w:rFonts w:ascii="Times New Roman" w:eastAsia="Times New Roman" w:hAnsi="Times New Roman" w:cs="Times New Roman"/>
-          <w:color w:val="1F1F1F"/>
-          <w:sz w:val="24"/>
-          <w:szCs w:val="24"/>
-          <w:bdr w:val="none" w:sz="0" w:space="0" w:color="auto" w:frame="1"/>
-          <w:lang w:val="en-ID" w:eastAsia="en-ID"/>
-        </w:rPr>
-        <w:t>Desember</w:t>
-      </w:r>
-      <w:r>
-        <w:rPr>
-          <w:rFonts w:ascii="Times New Roman" w:eastAsia="Times New Roman" w:hAnsi="Times New Roman" w:cs="Times New Roman"/>
-          <w:color w:val="1F1F1F"/>
-          <w:sz w:val="24"/>
-          <w:szCs w:val="24"/>
-          <w:bdr w:val="none" w:sz="0" w:space="0" w:color="auto" w:frame="1"/>
-          <w:lang w:val="en-ID" w:eastAsia="en-ID"/>
-        </w:rPr>
-        <w:t xml:space="preserve"> 202</w:t>
-      </w:r>
-      <w:r>
-        <w:rPr>
-          <w:rFonts w:ascii="Times New Roman" w:eastAsia="Times New Roman" w:hAnsi="Times New Roman" w:cs="Times New Roman"/>
-          <w:color w:val="1F1F1F"/>
-          <w:sz w:val="24"/>
-          <w:szCs w:val="24"/>
-          <w:bdr w:val="none" w:sz="0" w:space="0" w:color="auto" w:frame="1"/>
-          <w:lang w:val="en-ID" w:eastAsia="en-ID"/>
-        </w:rPr>
-        <w:t>5</w:t>
       </w:r>
       <w:r>
         <w:rPr>
@@ -1872,7 +1861,7 @@
 </file>
 
 <file path=word/numbering.xml><?xml version="1.0" encoding="utf-8"?>
-<w:numbering xmlns:wpc="http://schemas.microsoft.com/office/word/2010/wordprocessingCanvas" xmlns:cx="http://schemas.microsoft.com/office/drawing/2014/chartex" xmlns:cx1="http://schemas.microsoft.com/office/drawing/2015/9/8/chartex" xmlns:cx2="http://schemas.microsoft.com/office/drawing/2015/10/21/chartex" xmlns:cx3="http://schemas.microsoft.com/office/drawing/2016/5/9/chartex" xmlns:cx4="http://schemas.microsoft.com/office/drawing/2016/5/10/chartex" xmlns:cx5="http://schemas.microsoft.com/office/drawing/2016/5/11/chartex" xmlns:cx6="http://schemas.microsoft.com/office/drawing/2016/5/12/chartex" xmlns:cx7="http://schemas.microsoft.com/office/drawing/2016/5/13/chartex" xmlns:cx8="http://schemas.microsoft.com/office/drawing/2016/5/14/chartex" xmlns:mc="http://schemas.openxmlformats.org/markup-compatibility/2006" xmlns:aink="http://schemas.microsoft.com/office/drawing/2016/ink" xmlns:am3d="http://schemas.microsoft.com/office/drawing/2017/model3d" xmlns:o="urn:schemas-microsoft-com:office:office" xmlns:r="http://schemas.openxmlformats.org/officeDocument/2006/relationships" xmlns:m="http://schemas.openxmlformats.org/officeDocument/2006/math" xmlns:v="urn:schemas-microsoft-com:vml" xmlns:wp14="http://schemas.microsoft.com/office/word/2010/wordprocessingDrawing" xmlns:wp="http://schemas.openxmlformats.org/drawingml/2006/wordprocessingDrawing" xmlns:w10="urn:schemas-microsoft-com:office:word" xmlns:w="http://schemas.openxmlformats.org/wordprocessingml/2006/main" xmlns:w14="http://schemas.microsoft.com/office/word/2010/wordml" xmlns:w15="http://schemas.microsoft.com/office/word/2012/wordml" xmlns:w16cex="http://schemas.microsoft.com/office/word/2018/wordml/cex" xmlns:w16cid="http://schemas.microsoft.com/office/word/2016/wordml/cid" xmlns:w16="http://schemas.microsoft.com/office/word/2018/wordml" xmlns:w16sdtdh="http://schemas.microsoft.com/office/word/2020/wordml/sdtdatahash" xmlns:w16se="http://schemas.microsoft.com/office/word/2015/wordml/symex" xmlns:wpg="http://schemas.microsoft.com/office/word/2010/wordprocessingGroup" xmlns:wpi="http://schemas.microsoft.com/office/word/2010/wordprocessingInk" xmlns:wne="http://schemas.microsoft.com/office/word/2006/wordml" xmlns:wps="http://schemas.microsoft.com/office/word/2010/wordprocessingShape" mc:Ignorable="w14 w15 w16se w16cid w16 w16cex w16sdtdh wp14">
+<w:numbering xmlns:wpc="http://schemas.microsoft.com/office/word/2010/wordprocessingCanvas" xmlns:cx="http://schemas.microsoft.com/office/drawing/2014/chartex" xmlns:cx1="http://schemas.microsoft.com/office/drawing/2015/9/8/chartex" xmlns:cx2="http://schemas.microsoft.com/office/drawing/2015/10/21/chartex" xmlns:cx3="http://schemas.microsoft.com/office/drawing/2016/5/9/chartex" xmlns:cx4="http://schemas.microsoft.com/office/drawing/2016/5/10/chartex" xmlns:cx5="http://schemas.microsoft.com/office/drawing/2016/5/11/chartex" xmlns:cx6="http://schemas.microsoft.com/office/drawing/2016/5/12/chartex" xmlns:cx7="http://schemas.microsoft.com/office/drawing/2016/5/13/chartex" xmlns:cx8="http://schemas.microsoft.com/office/drawing/2016/5/14/chartex" xmlns:mc="http://schemas.openxmlformats.org/markup-compatibility/2006" xmlns:aink="http://schemas.microsoft.com/office/drawing/2016/ink" xmlns:am3d="http://schemas.microsoft.com/office/drawing/2017/model3d" xmlns:o="urn:schemas-microsoft-com:office:office" xmlns:oel="http://schemas.microsoft.com/office/2019/extlst" xmlns:r="http://schemas.openxmlformats.org/officeDocument/2006/relationships" xmlns:m="http://schemas.openxmlformats.org/officeDocument/2006/math" xmlns:v="urn:schemas-microsoft-com:vml" xmlns:wp14="http://schemas.microsoft.com/office/word/2010/wordprocessingDrawing" xmlns:wp="http://schemas.openxmlformats.org/drawingml/2006/wordprocessingDrawing" xmlns:w10="urn:schemas-microsoft-com:office:word" xmlns:w="http://schemas.openxmlformats.org/wordprocessingml/2006/main" xmlns:w14="http://schemas.microsoft.com/office/word/2010/wordml" xmlns:w15="http://schemas.microsoft.com/office/word/2012/wordml" xmlns:w16cex="http://schemas.microsoft.com/office/word/2018/wordml/cex" xmlns:w16cid="http://schemas.microsoft.com/office/word/2016/wordml/cid" xmlns:w16="http://schemas.microsoft.com/office/word/2018/wordml" xmlns:w16du="http://schemas.microsoft.com/office/word/2023/wordml/word16du" xmlns:w16sdtdh="http://schemas.microsoft.com/office/word/2020/wordml/sdtdatahash" xmlns:w16sdtfl="http://schemas.microsoft.com/office/word/2024/wordml/sdtformatlock" xmlns:w16se="http://schemas.microsoft.com/office/word/2015/wordml/symex" xmlns:wpg="http://schemas.microsoft.com/office/word/2010/wordprocessingGroup" xmlns:wpi="http://schemas.microsoft.com/office/word/2010/wordprocessingInk" xmlns:wne="http://schemas.microsoft.com/office/word/2006/wordml" xmlns:wps="http://schemas.microsoft.com/office/word/2010/wordprocessingShape" mc:Ignorable="w14 w15 w16se w16cid w16 w16cex w16sdtdh w16sdtfl w16du wp14">
   <w:abstractNum w:abstractNumId="0" w15:restartNumberingAfterBreak="0">
     <w:nsid w:val="0C763C16"/>
     <w:multiLevelType w:val="multilevel"/>
@@ -3630,50 +3619,50 @@
       </w:rPr>
     </w:lvl>
   </w:abstractNum>
-  <w:num w:numId="1">
+  <w:num w:numId="1" w16cid:durableId="1488590528">
     <w:abstractNumId w:val="6"/>
   </w:num>
-  <w:num w:numId="2">
+  <w:num w:numId="2" w16cid:durableId="1789356347">
     <w:abstractNumId w:val="7"/>
   </w:num>
-  <w:num w:numId="3">
+  <w:num w:numId="3" w16cid:durableId="707341037">
     <w:abstractNumId w:val="10"/>
   </w:num>
-  <w:num w:numId="4">
+  <w:num w:numId="4" w16cid:durableId="1968664348">
     <w:abstractNumId w:val="3"/>
   </w:num>
-  <w:num w:numId="5">
+  <w:num w:numId="5" w16cid:durableId="265695513">
     <w:abstractNumId w:val="1"/>
   </w:num>
-  <w:num w:numId="6">
+  <w:num w:numId="6" w16cid:durableId="1969161957">
     <w:abstractNumId w:val="0"/>
   </w:num>
-  <w:num w:numId="7">
+  <w:num w:numId="7" w16cid:durableId="1058743497">
     <w:abstractNumId w:val="2"/>
   </w:num>
-  <w:num w:numId="8">
+  <w:num w:numId="8" w16cid:durableId="435948097">
     <w:abstractNumId w:val="5"/>
   </w:num>
-  <w:num w:numId="9">
+  <w:num w:numId="9" w16cid:durableId="1252814181">
     <w:abstractNumId w:val="9"/>
   </w:num>
-  <w:num w:numId="10">
+  <w:num w:numId="10" w16cid:durableId="1692801688">
     <w:abstractNumId w:val="12"/>
   </w:num>
-  <w:num w:numId="11">
+  <w:num w:numId="11" w16cid:durableId="497885241">
     <w:abstractNumId w:val="11"/>
   </w:num>
-  <w:num w:numId="12">
+  <w:num w:numId="12" w16cid:durableId="2032291030">
     <w:abstractNumId w:val="4"/>
   </w:num>
-  <w:num w:numId="13">
+  <w:num w:numId="13" w16cid:durableId="2033336297">
     <w:abstractNumId w:val="8"/>
   </w:num>
 </w:numbering>
 </file>
 
 <file path=word/styles.xml><?xml version="1.0" encoding="utf-8"?>
-<w:styles xmlns:mc="http://schemas.openxmlformats.org/markup-compatibility/2006" xmlns:r="http://schemas.openxmlformats.org/officeDocument/2006/relationships" xmlns:w="http://schemas.openxmlformats.org/wordprocessingml/2006/main" xmlns:w14="http://schemas.microsoft.com/office/word/2010/wordml" xmlns:w15="http://schemas.microsoft.com/office/word/2012/wordml" xmlns:w16cex="http://schemas.microsoft.com/office/word/2018/wordml/cex" xmlns:w16cid="http://schemas.microsoft.com/office/word/2016/wordml/cid" xmlns:w16="http://schemas.microsoft.com/office/word/2018/wordml" xmlns:w16sdtdh="http://schemas.microsoft.com/office/word/2020/wordml/sdtdatahash" xmlns:w16se="http://schemas.microsoft.com/office/word/2015/wordml/symex" mc:Ignorable="w14 w15 w16se w16cid w16 w16cex w16sdtdh">
+<w:styles xmlns:mc="http://schemas.openxmlformats.org/markup-compatibility/2006" xmlns:r="http://schemas.openxmlformats.org/officeDocument/2006/relationships" xmlns:w="http://schemas.openxmlformats.org/wordprocessingml/2006/main" xmlns:w14="http://schemas.microsoft.com/office/word/2010/wordml" xmlns:w15="http://schemas.microsoft.com/office/word/2012/wordml" xmlns:w16cex="http://schemas.microsoft.com/office/word/2018/wordml/cex" xmlns:w16cid="http://schemas.microsoft.com/office/word/2016/wordml/cid" xmlns:w16="http://schemas.microsoft.com/office/word/2018/wordml" xmlns:w16du="http://schemas.microsoft.com/office/word/2023/wordml/word16du" xmlns:w16sdtdh="http://schemas.microsoft.com/office/word/2020/wordml/sdtdatahash" xmlns:w16sdtfl="http://schemas.microsoft.com/office/word/2024/wordml/sdtformatlock" xmlns:w16se="http://schemas.microsoft.com/office/word/2015/wordml/symex" mc:Ignorable="w14 w15 w16se w16cid w16 w16cex w16sdtdh w16sdtfl w16du">
   <w:docDefaults>
     <w:rPrDefault>
       <w:rPr>

</xml_diff>